<commit_message>
add js import export test to CI
</commit_message>
<xml_diff>
--- a/fiduswriter/document/static/js/modules/importer/__tests__/fixtures/comprehensive-test.docx
+++ b/fiduswriter/document/static/js/modules/importer/__tests__/fixtures/comprehensive-test.docx
@@ -517,7 +517,7 @@
       </w:r>
     </w:p>
     <w:p>
-      <w:ins w:id="161" w:author="Jane Doe" w:date="2026-05-14T17:44:15.136812Z">
+      <w:ins w:id="87985" w:author="Jane Doe" w:date="2026-05-14T20:17:31.591879Z">
         <w:r>
           <w:t>Inserted tracked text. </w:t>
         </w:r>
@@ -528,7 +528,7 @@
         </w:rPr>
         <w:t>Original stable text.</w:t>
       </w:r>
-      <w:del w:id="61352" w:author="Jane Doe" w:date="2026-05-14T17:44:15.136925Z">
+      <w:del w:id="94632" w:author="Jane Doe" w:date="2026-05-14T20:17:31.591996Z">
         <w:r>
           <w:delText>Deleted tracked text.</w:delText>
         </w:r>
@@ -574,6 +574,29 @@
         </w:rPr>
         <w:t xml:space="preserve"> word.</w:t>
       </w:r>
+    </w:p>
+    <w:p>
+      <w:pPr>
+        <w:pStyle w:val="Heading2"/>
+      </w:pPr>
+      <w:r>
+        <w:t>Citations</w:t>
+      </w:r>
+    </w:p>
+    <w:p>
+      <w:r>
+        <w:rPr>
+          <w:sz w:val="22"/>
+        </w:rPr>
+        <w:t xml:space="preserve">This paragraph contains a citation: </w:t>
+      </w:r>
+      <w:fldChar w:fldCharType="begin"/>
+      <w:instrText xml:space="preserve">ADDIN ZOTERO_ITEM CSL_CITATION{"citationID": "Doe2012", "properties": {"formattedCitation": "Doe, 2012", "plainCitation": "Doe, 2012", "noteIndex": 0}, "citationItems": [{"id": "Doe2012", "uris": ["http://zotero.org/items/Doe2012"], "itemData": {"title": "My title", "author": [{"family": "Doe", "given": "John"}], "date": "2012"}}]</w:instrText>
+      <w:fldChar w:fldCharType="separate"/>
+      <w:r>
+        <w:t>Doe, 2012</w:t>
+      </w:r>
+      <w:fldChar w:fldCharType="end"/>
     </w:p>
     <w:sectPr>
       <w:pgSz w:w="12240" w:h="15840"/>

</xml_diff>